<commit_message>
refactor: refactor ParsePlaceholders for conciseness and adaptability
- avoid panic with corrupted placeholder
- support any run spans between delimeters
- update `template.docx` to include corrupted and nested cases
- lay foundation for a template engine to be introduced

closes #29
</commit_message>
<xml_diff>
--- a/test/template.docx
+++ b/test/template.docx
@@ -1,7 +1,92 @@
 
 <file path=word/document.xml><?xml version="1.0" encoding="utf-8"?>
-<w:document xmlns:wpc="http://schemas.microsoft.com/office/word/2010/wordprocessingCanvas" xmlns:cx="http://schemas.microsoft.com/office/drawing/2014/chartex" xmlns:cx1="http://schemas.microsoft.com/office/drawing/2015/9/8/chartex" xmlns:cx2="http://schemas.microsoft.com/office/drawing/2015/10/21/chartex" xmlns:cx3="http://schemas.microsoft.com/office/drawing/2016/5/9/chartex" xmlns:cx4="http://schemas.microsoft.com/office/drawing/2016/5/10/chartex" xmlns:cx5="http://schemas.microsoft.com/office/drawing/2016/5/11/chartex" xmlns:cx6="http://schemas.microsoft.com/office/drawing/2016/5/12/chartex" xmlns:cx7="http://schemas.microsoft.com/office/drawing/2016/5/13/chartex" xmlns:cx8="http://schemas.microsoft.com/office/drawing/2016/5/14/chartex" xmlns:mc="http://schemas.openxmlformats.org/markup-compatibility/2006" xmlns:aink="http://schemas.microsoft.com/office/drawing/2016/ink" xmlns:am3d="http://schemas.microsoft.com/office/drawing/2017/model3d" xmlns:o="urn:schemas-microsoft-com:office:office" xmlns:oel="http://schemas.microsoft.com/office/2019/extlst" xmlns:r="http://schemas.openxmlformats.org/officeDocument/2006/relationships" xmlns:m="http://schemas.openxmlformats.org/officeDocument/2006/math" xmlns:v="urn:schemas-microsoft-com:vml" xmlns:wp14="http://schemas.microsoft.com/office/word/2010/wordprocessingDrawing" xmlns:wp="http://schemas.openxmlformats.org/drawingml/2006/wordprocessingDrawing" xmlns:w10="urn:schemas-microsoft-com:office:word" xmlns:w="http://schemas.openxmlformats.org/wordprocessingml/2006/main" xmlns:w14="http://schemas.microsoft.com/office/word/2010/wordml" xmlns:w15="http://schemas.microsoft.com/office/word/2012/wordml" xmlns:w16cex="http://schemas.microsoft.com/office/word/2018/wordml/cex" xmlns:w16cid="http://schemas.microsoft.com/office/word/2016/wordml/cid" xmlns:w16="http://schemas.microsoft.com/office/word/2018/wordml" xmlns:w16sdtdh="http://schemas.microsoft.com/office/word/2020/wordml/sdtdatahash" xmlns:w16se="http://schemas.microsoft.com/office/word/2015/wordml/symex" xmlns:wpg="http://schemas.microsoft.com/office/word/2010/wordprocessingGroup" xmlns:wpi="http://schemas.microsoft.com/office/word/2010/wordprocessingInk" xmlns:wne="http://schemas.microsoft.com/office/word/2006/wordml" xmlns:wps="http://schemas.microsoft.com/office/word/2010/wordprocessingShape" mc:Ignorable="w14 w15 w16se w16cid w16 w16cex w16sdtdh wp14">
+<w:document xmlns:wpc="http://schemas.microsoft.com/office/word/2010/wordprocessingCanvas" xmlns:cx="http://schemas.microsoft.com/office/drawing/2014/chartex" xmlns:cx1="http://schemas.microsoft.com/office/drawing/2015/9/8/chartex" xmlns:cx2="http://schemas.microsoft.com/office/drawing/2015/10/21/chartex" xmlns:cx3="http://schemas.microsoft.com/office/drawing/2016/5/9/chartex" xmlns:cx4="http://schemas.microsoft.com/office/drawing/2016/5/10/chartex" xmlns:cx5="http://schemas.microsoft.com/office/drawing/2016/5/11/chartex" xmlns:cx6="http://schemas.microsoft.com/office/drawing/2016/5/12/chartex" xmlns:cx7="http://schemas.microsoft.com/office/drawing/2016/5/13/chartex" xmlns:cx8="http://schemas.microsoft.com/office/drawing/2016/5/14/chartex" xmlns:mc="http://schemas.openxmlformats.org/markup-compatibility/2006" xmlns:aink="http://schemas.microsoft.com/office/drawing/2016/ink" xmlns:am3d="http://schemas.microsoft.com/office/drawing/2017/model3d" xmlns:o="urn:schemas-microsoft-com:office:office" xmlns:oel="http://schemas.microsoft.com/office/2019/extlst" xmlns:r="http://schemas.openxmlformats.org/officeDocument/2006/relationships" xmlns:m="http://schemas.openxmlformats.org/officeDocument/2006/math" xmlns:v="urn:schemas-microsoft-com:vml" xmlns:wp14="http://schemas.microsoft.com/office/word/2010/wordprocessingDrawing" xmlns:wp="http://schemas.openxmlformats.org/drawingml/2006/wordprocessingDrawing" xmlns:w10="urn:schemas-microsoft-com:office:word" xmlns:w="http://schemas.openxmlformats.org/wordprocessingml/2006/main" xmlns:w14="http://schemas.microsoft.com/office/word/2010/wordml" xmlns:w15="http://schemas.microsoft.com/office/word/2012/wordml" xmlns:w16cex="http://schemas.microsoft.com/office/word/2018/wordml/cex" xmlns:w16cid="http://schemas.microsoft.com/office/word/2016/wordml/cid" xmlns:w16="http://schemas.microsoft.com/office/word/2018/wordml" xmlns:w16du="http://schemas.microsoft.com/office/word/2023/wordml/word16du" xmlns:w16sdtdh="http://schemas.microsoft.com/office/word/2020/wordml/sdtdatahash" xmlns:w16se="http://schemas.microsoft.com/office/word/2015/wordml/symex" xmlns:wpg="http://schemas.microsoft.com/office/word/2010/wordprocessingGroup" xmlns:wpi="http://schemas.microsoft.com/office/word/2010/wordprocessingInk" xmlns:wne="http://schemas.microsoft.com/office/word/2006/wordml" xmlns:wps="http://schemas.microsoft.com/office/word/2010/wordprocessingShape" mc:Ignorable="w14 w15 w16se w16cid w16 w16cex w16sdtdh w16du wp14">
   <w:body>
+    <w:p>
+      <w:pPr>
+        <w:rPr>
+          <w:rFonts w:ascii="Lato" w:hAnsi="Lato"/>
+          <w:color w:val="FF0000"/>
+          <w:lang w:val="en-US"/>
+        </w:rPr>
+      </w:pPr>
+      <w:r>
+        <w:rPr>
+          <w:rFonts w:ascii="Lato" w:hAnsi="Lato"/>
+          <w:color w:val="FF0000"/>
+          <w:lang w:val="en-US"/>
+        </w:rPr>
+        <w:t>{{open</w:t>
+      </w:r>
+    </w:p>
+    <w:p>
+      <w:pPr>
+        <w:rPr>
+          <w:rFonts w:ascii="Lato" w:hAnsi="Lato"/>
+          <w:color w:val="FF0000"/>
+          <w:lang w:val="en-US"/>
+        </w:rPr>
+      </w:pPr>
+    </w:p>
+    <w:p>
+      <w:pPr>
+        <w:rPr>
+          <w:rFonts w:ascii="Lato" w:hAnsi="Lato"/>
+          <w:color w:val="FF0000"/>
+          <w:lang w:val="en-US"/>
+        </w:rPr>
+      </w:pPr>
+      <w:r>
+        <w:rPr>
+          <w:rFonts w:ascii="Lato" w:hAnsi="Lato"/>
+          <w:color w:val="FF0000"/>
+          <w:lang w:val="en-US"/>
+        </w:rPr>
+        <w:t>close}}</w:t>
+      </w:r>
+    </w:p>
+    <w:p>
+      <w:pPr>
+        <w:rPr>
+          <w:rFonts w:ascii="Lato" w:hAnsi="Lato"/>
+          <w:color w:val="FF0000"/>
+          <w:lang w:val="en-US"/>
+        </w:rPr>
+      </w:pPr>
+    </w:p>
+    <w:p>
+      <w:pPr>
+        <w:rPr>
+          <w:rFonts w:ascii="Lato" w:hAnsi="Lato"/>
+          <w:color w:val="FF0000"/>
+          <w:lang w:val="en-US"/>
+        </w:rPr>
+      </w:pPr>
+      <w:r>
+        <w:rPr>
+          <w:rFonts w:ascii="Lato" w:hAnsi="Lato"/>
+          <w:color w:val="FF0000"/>
+          <w:lang w:val="en-US"/>
+        </w:rPr>
+        <w:t>{{{</w:t>
+      </w:r>
+      <w:r>
+        <w:rPr>
+          <w:rFonts w:ascii="Lato" w:hAnsi="Lato"/>
+          <w:color w:val="FF0000"/>
+          <w:lang w:val="en-US"/>
+        </w:rPr>
+        <w:t>nested</w:t>
+      </w:r>
+      <w:r>
+        <w:rPr>
+          <w:rFonts w:ascii="Lato" w:hAnsi="Lato"/>
+          <w:color w:val="FF0000"/>
+          <w:lang w:val="en-US"/>
+        </w:rPr>
+        <w:t>}}}</w:t>
+      </w:r>
+    </w:p>
     <w:p>
       <w:r>
         <w:rPr>
@@ -703,6 +788,7 @@
           <w:color w:val="FF0000"/>
           <w:lang w:val="en-US"/>
         </w:rPr>
+        <w:lastRenderedPageBreak/>
         <w:drawing>
           <wp:inline distT="0" distB="0" distL="0" distR="0" wp14:anchorId="1BA11236" wp14:editId="7F7F9060">
             <wp:extent cx="1613948" cy="1613948"/>
@@ -762,7 +848,7 @@
 </file>
 
 <file path=word/endnotes.xml><?xml version="1.0" encoding="utf-8"?>
-<w:endnotes xmlns:wpc="http://schemas.microsoft.com/office/word/2010/wordprocessingCanvas" xmlns:cx="http://schemas.microsoft.com/office/drawing/2014/chartex" xmlns:cx1="http://schemas.microsoft.com/office/drawing/2015/9/8/chartex" xmlns:cx2="http://schemas.microsoft.com/office/drawing/2015/10/21/chartex" xmlns:cx3="http://schemas.microsoft.com/office/drawing/2016/5/9/chartex" xmlns:cx4="http://schemas.microsoft.com/office/drawing/2016/5/10/chartex" xmlns:cx5="http://schemas.microsoft.com/office/drawing/2016/5/11/chartex" xmlns:cx6="http://schemas.microsoft.com/office/drawing/2016/5/12/chartex" xmlns:cx7="http://schemas.microsoft.com/office/drawing/2016/5/13/chartex" xmlns:cx8="http://schemas.microsoft.com/office/drawing/2016/5/14/chartex" xmlns:mc="http://schemas.openxmlformats.org/markup-compatibility/2006" xmlns:aink="http://schemas.microsoft.com/office/drawing/2016/ink" xmlns:am3d="http://schemas.microsoft.com/office/drawing/2017/model3d" xmlns:o="urn:schemas-microsoft-com:office:office" xmlns:oel="http://schemas.microsoft.com/office/2019/extlst" xmlns:r="http://schemas.openxmlformats.org/officeDocument/2006/relationships" xmlns:m="http://schemas.openxmlformats.org/officeDocument/2006/math" xmlns:v="urn:schemas-microsoft-com:vml" xmlns:wp14="http://schemas.microsoft.com/office/word/2010/wordprocessingDrawing" xmlns:wp="http://schemas.openxmlformats.org/drawingml/2006/wordprocessingDrawing" xmlns:w10="urn:schemas-microsoft-com:office:word" xmlns:w="http://schemas.openxmlformats.org/wordprocessingml/2006/main" xmlns:w14="http://schemas.microsoft.com/office/word/2010/wordml" xmlns:w15="http://schemas.microsoft.com/office/word/2012/wordml" xmlns:w16cex="http://schemas.microsoft.com/office/word/2018/wordml/cex" xmlns:w16cid="http://schemas.microsoft.com/office/word/2016/wordml/cid" xmlns:w16="http://schemas.microsoft.com/office/word/2018/wordml" xmlns:w16sdtdh="http://schemas.microsoft.com/office/word/2020/wordml/sdtdatahash" xmlns:w16se="http://schemas.microsoft.com/office/word/2015/wordml/symex" xmlns:wpg="http://schemas.microsoft.com/office/word/2010/wordprocessingGroup" xmlns:wpi="http://schemas.microsoft.com/office/word/2010/wordprocessingInk" xmlns:wne="http://schemas.microsoft.com/office/word/2006/wordml" xmlns:wps="http://schemas.microsoft.com/office/word/2010/wordprocessingShape" mc:Ignorable="w14 w15 w16se w16cid w16 w16cex w16sdtdh wp14">
+<w:endnotes xmlns:wpc="http://schemas.microsoft.com/office/word/2010/wordprocessingCanvas" xmlns:cx="http://schemas.microsoft.com/office/drawing/2014/chartex" xmlns:cx1="http://schemas.microsoft.com/office/drawing/2015/9/8/chartex" xmlns:cx2="http://schemas.microsoft.com/office/drawing/2015/10/21/chartex" xmlns:cx3="http://schemas.microsoft.com/office/drawing/2016/5/9/chartex" xmlns:cx4="http://schemas.microsoft.com/office/drawing/2016/5/10/chartex" xmlns:cx5="http://schemas.microsoft.com/office/drawing/2016/5/11/chartex" xmlns:cx6="http://schemas.microsoft.com/office/drawing/2016/5/12/chartex" xmlns:cx7="http://schemas.microsoft.com/office/drawing/2016/5/13/chartex" xmlns:cx8="http://schemas.microsoft.com/office/drawing/2016/5/14/chartex" xmlns:mc="http://schemas.openxmlformats.org/markup-compatibility/2006" xmlns:aink="http://schemas.microsoft.com/office/drawing/2016/ink" xmlns:am3d="http://schemas.microsoft.com/office/drawing/2017/model3d" xmlns:o="urn:schemas-microsoft-com:office:office" xmlns:oel="http://schemas.microsoft.com/office/2019/extlst" xmlns:r="http://schemas.openxmlformats.org/officeDocument/2006/relationships" xmlns:m="http://schemas.openxmlformats.org/officeDocument/2006/math" xmlns:v="urn:schemas-microsoft-com:vml" xmlns:wp14="http://schemas.microsoft.com/office/word/2010/wordprocessingDrawing" xmlns:wp="http://schemas.openxmlformats.org/drawingml/2006/wordprocessingDrawing" xmlns:w10="urn:schemas-microsoft-com:office:word" xmlns:w="http://schemas.openxmlformats.org/wordprocessingml/2006/main" xmlns:w14="http://schemas.microsoft.com/office/word/2010/wordml" xmlns:w15="http://schemas.microsoft.com/office/word/2012/wordml" xmlns:w16cex="http://schemas.microsoft.com/office/word/2018/wordml/cex" xmlns:w16cid="http://schemas.microsoft.com/office/word/2016/wordml/cid" xmlns:w16="http://schemas.microsoft.com/office/word/2018/wordml" xmlns:w16du="http://schemas.microsoft.com/office/word/2023/wordml/word16du" xmlns:w16sdtdh="http://schemas.microsoft.com/office/word/2020/wordml/sdtdatahash" xmlns:w16se="http://schemas.microsoft.com/office/word/2015/wordml/symex" xmlns:wpg="http://schemas.microsoft.com/office/word/2010/wordprocessingGroup" xmlns:wpi="http://schemas.microsoft.com/office/word/2010/wordprocessingInk" xmlns:wne="http://schemas.microsoft.com/office/word/2006/wordml" xmlns:wps="http://schemas.microsoft.com/office/word/2010/wordprocessingShape" mc:Ignorable="w14 w15 w16se w16cid w16 w16cex w16sdtdh w16du wp14">
   <w:endnote w:type="separator" w:id="-1">
     <w:p>
       <w:r>
@@ -781,7 +867,7 @@
 </file>
 
 <file path=word/footer1.xml><?xml version="1.0" encoding="utf-8"?>
-<w:ftr xmlns:wpc="http://schemas.microsoft.com/office/word/2010/wordprocessingCanvas" xmlns:cx="http://schemas.microsoft.com/office/drawing/2014/chartex" xmlns:cx1="http://schemas.microsoft.com/office/drawing/2015/9/8/chartex" xmlns:cx2="http://schemas.microsoft.com/office/drawing/2015/10/21/chartex" xmlns:cx3="http://schemas.microsoft.com/office/drawing/2016/5/9/chartex" xmlns:cx4="http://schemas.microsoft.com/office/drawing/2016/5/10/chartex" xmlns:cx5="http://schemas.microsoft.com/office/drawing/2016/5/11/chartex" xmlns:cx6="http://schemas.microsoft.com/office/drawing/2016/5/12/chartex" xmlns:cx7="http://schemas.microsoft.com/office/drawing/2016/5/13/chartex" xmlns:cx8="http://schemas.microsoft.com/office/drawing/2016/5/14/chartex" xmlns:mc="http://schemas.openxmlformats.org/markup-compatibility/2006" xmlns:aink="http://schemas.microsoft.com/office/drawing/2016/ink" xmlns:am3d="http://schemas.microsoft.com/office/drawing/2017/model3d" xmlns:o="urn:schemas-microsoft-com:office:office" xmlns:oel="http://schemas.microsoft.com/office/2019/extlst" xmlns:r="http://schemas.openxmlformats.org/officeDocument/2006/relationships" xmlns:m="http://schemas.openxmlformats.org/officeDocument/2006/math" xmlns:v="urn:schemas-microsoft-com:vml" xmlns:wp14="http://schemas.microsoft.com/office/word/2010/wordprocessingDrawing" xmlns:wp="http://schemas.openxmlformats.org/drawingml/2006/wordprocessingDrawing" xmlns:w10="urn:schemas-microsoft-com:office:word" xmlns:w="http://schemas.openxmlformats.org/wordprocessingml/2006/main" xmlns:w14="http://schemas.microsoft.com/office/word/2010/wordml" xmlns:w15="http://schemas.microsoft.com/office/word/2012/wordml" xmlns:w16cex="http://schemas.microsoft.com/office/word/2018/wordml/cex" xmlns:w16cid="http://schemas.microsoft.com/office/word/2016/wordml/cid" xmlns:w16="http://schemas.microsoft.com/office/word/2018/wordml" xmlns:w16sdtdh="http://schemas.microsoft.com/office/word/2020/wordml/sdtdatahash" xmlns:w16se="http://schemas.microsoft.com/office/word/2015/wordml/symex" xmlns:wpg="http://schemas.microsoft.com/office/word/2010/wordprocessingGroup" xmlns:wpi="http://schemas.microsoft.com/office/word/2010/wordprocessingInk" xmlns:wne="http://schemas.microsoft.com/office/word/2006/wordml" xmlns:wps="http://schemas.microsoft.com/office/word/2010/wordprocessingShape" mc:Ignorable="w14 w15 w16se w16cid w16 w16cex w16sdtdh wp14">
+<w:ftr xmlns:wpc="http://schemas.microsoft.com/office/word/2010/wordprocessingCanvas" xmlns:cx="http://schemas.microsoft.com/office/drawing/2014/chartex" xmlns:cx1="http://schemas.microsoft.com/office/drawing/2015/9/8/chartex" xmlns:cx2="http://schemas.microsoft.com/office/drawing/2015/10/21/chartex" xmlns:cx3="http://schemas.microsoft.com/office/drawing/2016/5/9/chartex" xmlns:cx4="http://schemas.microsoft.com/office/drawing/2016/5/10/chartex" xmlns:cx5="http://schemas.microsoft.com/office/drawing/2016/5/11/chartex" xmlns:cx6="http://schemas.microsoft.com/office/drawing/2016/5/12/chartex" xmlns:cx7="http://schemas.microsoft.com/office/drawing/2016/5/13/chartex" xmlns:cx8="http://schemas.microsoft.com/office/drawing/2016/5/14/chartex" xmlns:mc="http://schemas.openxmlformats.org/markup-compatibility/2006" xmlns:aink="http://schemas.microsoft.com/office/drawing/2016/ink" xmlns:am3d="http://schemas.microsoft.com/office/drawing/2017/model3d" xmlns:o="urn:schemas-microsoft-com:office:office" xmlns:oel="http://schemas.microsoft.com/office/2019/extlst" xmlns:r="http://schemas.openxmlformats.org/officeDocument/2006/relationships" xmlns:m="http://schemas.openxmlformats.org/officeDocument/2006/math" xmlns:v="urn:schemas-microsoft-com:vml" xmlns:wp14="http://schemas.microsoft.com/office/word/2010/wordprocessingDrawing" xmlns:wp="http://schemas.openxmlformats.org/drawingml/2006/wordprocessingDrawing" xmlns:w10="urn:schemas-microsoft-com:office:word" xmlns:w="http://schemas.openxmlformats.org/wordprocessingml/2006/main" xmlns:w14="http://schemas.microsoft.com/office/word/2010/wordml" xmlns:w15="http://schemas.microsoft.com/office/word/2012/wordml" xmlns:w16cex="http://schemas.microsoft.com/office/word/2018/wordml/cex" xmlns:w16cid="http://schemas.microsoft.com/office/word/2016/wordml/cid" xmlns:w16="http://schemas.microsoft.com/office/word/2018/wordml" xmlns:w16du="http://schemas.microsoft.com/office/word/2023/wordml/word16du" xmlns:w16sdtdh="http://schemas.microsoft.com/office/word/2020/wordml/sdtdatahash" xmlns:w16se="http://schemas.microsoft.com/office/word/2015/wordml/symex" xmlns:wpg="http://schemas.microsoft.com/office/word/2010/wordprocessingGroup" xmlns:wpi="http://schemas.microsoft.com/office/word/2010/wordprocessingInk" xmlns:wne="http://schemas.microsoft.com/office/word/2006/wordml" xmlns:wps="http://schemas.microsoft.com/office/word/2010/wordprocessingShape" mc:Ignorable="w14 w15 w16se w16cid w16 w16cex w16sdtdh w16du wp14">
   <w:p>
     <w:pPr>
       <w:pStyle w:val="a5"/>
@@ -798,7 +884,7 @@
 </file>
 
 <file path=word/footnotes.xml><?xml version="1.0" encoding="utf-8"?>
-<w:footnotes xmlns:wpc="http://schemas.microsoft.com/office/word/2010/wordprocessingCanvas" xmlns:cx="http://schemas.microsoft.com/office/drawing/2014/chartex" xmlns:cx1="http://schemas.microsoft.com/office/drawing/2015/9/8/chartex" xmlns:cx2="http://schemas.microsoft.com/office/drawing/2015/10/21/chartex" xmlns:cx3="http://schemas.microsoft.com/office/drawing/2016/5/9/chartex" xmlns:cx4="http://schemas.microsoft.com/office/drawing/2016/5/10/chartex" xmlns:cx5="http://schemas.microsoft.com/office/drawing/2016/5/11/chartex" xmlns:cx6="http://schemas.microsoft.com/office/drawing/2016/5/12/chartex" xmlns:cx7="http://schemas.microsoft.com/office/drawing/2016/5/13/chartex" xmlns:cx8="http://schemas.microsoft.com/office/drawing/2016/5/14/chartex" xmlns:mc="http://schemas.openxmlformats.org/markup-compatibility/2006" xmlns:aink="http://schemas.microsoft.com/office/drawing/2016/ink" xmlns:am3d="http://schemas.microsoft.com/office/drawing/2017/model3d" xmlns:o="urn:schemas-microsoft-com:office:office" xmlns:oel="http://schemas.microsoft.com/office/2019/extlst" xmlns:r="http://schemas.openxmlformats.org/officeDocument/2006/relationships" xmlns:m="http://schemas.openxmlformats.org/officeDocument/2006/math" xmlns:v="urn:schemas-microsoft-com:vml" xmlns:wp14="http://schemas.microsoft.com/office/word/2010/wordprocessingDrawing" xmlns:wp="http://schemas.openxmlformats.org/drawingml/2006/wordprocessingDrawing" xmlns:w10="urn:schemas-microsoft-com:office:word" xmlns:w="http://schemas.openxmlformats.org/wordprocessingml/2006/main" xmlns:w14="http://schemas.microsoft.com/office/word/2010/wordml" xmlns:w15="http://schemas.microsoft.com/office/word/2012/wordml" xmlns:w16cex="http://schemas.microsoft.com/office/word/2018/wordml/cex" xmlns:w16cid="http://schemas.microsoft.com/office/word/2016/wordml/cid" xmlns:w16="http://schemas.microsoft.com/office/word/2018/wordml" xmlns:w16sdtdh="http://schemas.microsoft.com/office/word/2020/wordml/sdtdatahash" xmlns:w16se="http://schemas.microsoft.com/office/word/2015/wordml/symex" xmlns:wpg="http://schemas.microsoft.com/office/word/2010/wordprocessingGroup" xmlns:wpi="http://schemas.microsoft.com/office/word/2010/wordprocessingInk" xmlns:wne="http://schemas.microsoft.com/office/word/2006/wordml" xmlns:wps="http://schemas.microsoft.com/office/word/2010/wordprocessingShape" mc:Ignorable="w14 w15 w16se w16cid w16 w16cex w16sdtdh wp14">
+<w:footnotes xmlns:wpc="http://schemas.microsoft.com/office/word/2010/wordprocessingCanvas" xmlns:cx="http://schemas.microsoft.com/office/drawing/2014/chartex" xmlns:cx1="http://schemas.microsoft.com/office/drawing/2015/9/8/chartex" xmlns:cx2="http://schemas.microsoft.com/office/drawing/2015/10/21/chartex" xmlns:cx3="http://schemas.microsoft.com/office/drawing/2016/5/9/chartex" xmlns:cx4="http://schemas.microsoft.com/office/drawing/2016/5/10/chartex" xmlns:cx5="http://schemas.microsoft.com/office/drawing/2016/5/11/chartex" xmlns:cx6="http://schemas.microsoft.com/office/drawing/2016/5/12/chartex" xmlns:cx7="http://schemas.microsoft.com/office/drawing/2016/5/13/chartex" xmlns:cx8="http://schemas.microsoft.com/office/drawing/2016/5/14/chartex" xmlns:mc="http://schemas.openxmlformats.org/markup-compatibility/2006" xmlns:aink="http://schemas.microsoft.com/office/drawing/2016/ink" xmlns:am3d="http://schemas.microsoft.com/office/drawing/2017/model3d" xmlns:o="urn:schemas-microsoft-com:office:office" xmlns:oel="http://schemas.microsoft.com/office/2019/extlst" xmlns:r="http://schemas.openxmlformats.org/officeDocument/2006/relationships" xmlns:m="http://schemas.openxmlformats.org/officeDocument/2006/math" xmlns:v="urn:schemas-microsoft-com:vml" xmlns:wp14="http://schemas.microsoft.com/office/word/2010/wordprocessingDrawing" xmlns:wp="http://schemas.openxmlformats.org/drawingml/2006/wordprocessingDrawing" xmlns:w10="urn:schemas-microsoft-com:office:word" xmlns:w="http://schemas.openxmlformats.org/wordprocessingml/2006/main" xmlns:w14="http://schemas.microsoft.com/office/word/2010/wordml" xmlns:w15="http://schemas.microsoft.com/office/word/2012/wordml" xmlns:w16cex="http://schemas.microsoft.com/office/word/2018/wordml/cex" xmlns:w16cid="http://schemas.microsoft.com/office/word/2016/wordml/cid" xmlns:w16="http://schemas.microsoft.com/office/word/2018/wordml" xmlns:w16du="http://schemas.microsoft.com/office/word/2023/wordml/word16du" xmlns:w16sdtdh="http://schemas.microsoft.com/office/word/2020/wordml/sdtdatahash" xmlns:w16se="http://schemas.microsoft.com/office/word/2015/wordml/symex" xmlns:wpg="http://schemas.microsoft.com/office/word/2010/wordprocessingGroup" xmlns:wpi="http://schemas.microsoft.com/office/word/2010/wordprocessingInk" xmlns:wne="http://schemas.microsoft.com/office/word/2006/wordml" xmlns:wps="http://schemas.microsoft.com/office/word/2010/wordprocessingShape" mc:Ignorable="w14 w15 w16se w16cid w16 w16cex w16sdtdh w16du wp14">
   <w:footnote w:type="separator" w:id="-1">
     <w:p>
       <w:r>
@@ -817,7 +903,7 @@
 </file>
 
 <file path=word/header1.xml><?xml version="1.0" encoding="utf-8"?>
-<w:hdr xmlns:wpc="http://schemas.microsoft.com/office/word/2010/wordprocessingCanvas" xmlns:cx="http://schemas.microsoft.com/office/drawing/2014/chartex" xmlns:cx1="http://schemas.microsoft.com/office/drawing/2015/9/8/chartex" xmlns:cx2="http://schemas.microsoft.com/office/drawing/2015/10/21/chartex" xmlns:cx3="http://schemas.microsoft.com/office/drawing/2016/5/9/chartex" xmlns:cx4="http://schemas.microsoft.com/office/drawing/2016/5/10/chartex" xmlns:cx5="http://schemas.microsoft.com/office/drawing/2016/5/11/chartex" xmlns:cx6="http://schemas.microsoft.com/office/drawing/2016/5/12/chartex" xmlns:cx7="http://schemas.microsoft.com/office/drawing/2016/5/13/chartex" xmlns:cx8="http://schemas.microsoft.com/office/drawing/2016/5/14/chartex" xmlns:mc="http://schemas.openxmlformats.org/markup-compatibility/2006" xmlns:aink="http://schemas.microsoft.com/office/drawing/2016/ink" xmlns:am3d="http://schemas.microsoft.com/office/drawing/2017/model3d" xmlns:o="urn:schemas-microsoft-com:office:office" xmlns:oel="http://schemas.microsoft.com/office/2019/extlst" xmlns:r="http://schemas.openxmlformats.org/officeDocument/2006/relationships" xmlns:m="http://schemas.openxmlformats.org/officeDocument/2006/math" xmlns:v="urn:schemas-microsoft-com:vml" xmlns:wp14="http://schemas.microsoft.com/office/word/2010/wordprocessingDrawing" xmlns:wp="http://schemas.openxmlformats.org/drawingml/2006/wordprocessingDrawing" xmlns:w10="urn:schemas-microsoft-com:office:word" xmlns:w="http://schemas.openxmlformats.org/wordprocessingml/2006/main" xmlns:w14="http://schemas.microsoft.com/office/word/2010/wordml" xmlns:w15="http://schemas.microsoft.com/office/word/2012/wordml" xmlns:w16cex="http://schemas.microsoft.com/office/word/2018/wordml/cex" xmlns:w16cid="http://schemas.microsoft.com/office/word/2016/wordml/cid" xmlns:w16="http://schemas.microsoft.com/office/word/2018/wordml" xmlns:w16sdtdh="http://schemas.microsoft.com/office/word/2020/wordml/sdtdatahash" xmlns:w16se="http://schemas.microsoft.com/office/word/2015/wordml/symex" xmlns:wpg="http://schemas.microsoft.com/office/word/2010/wordprocessingGroup" xmlns:wpi="http://schemas.microsoft.com/office/word/2010/wordprocessingInk" xmlns:wne="http://schemas.microsoft.com/office/word/2006/wordml" xmlns:wps="http://schemas.microsoft.com/office/word/2010/wordprocessingShape" mc:Ignorable="w14 w15 w16se w16cid w16 w16cex w16sdtdh wp14">
+<w:hdr xmlns:wpc="http://schemas.microsoft.com/office/word/2010/wordprocessingCanvas" xmlns:cx="http://schemas.microsoft.com/office/drawing/2014/chartex" xmlns:cx1="http://schemas.microsoft.com/office/drawing/2015/9/8/chartex" xmlns:cx2="http://schemas.microsoft.com/office/drawing/2015/10/21/chartex" xmlns:cx3="http://schemas.microsoft.com/office/drawing/2016/5/9/chartex" xmlns:cx4="http://schemas.microsoft.com/office/drawing/2016/5/10/chartex" xmlns:cx5="http://schemas.microsoft.com/office/drawing/2016/5/11/chartex" xmlns:cx6="http://schemas.microsoft.com/office/drawing/2016/5/12/chartex" xmlns:cx7="http://schemas.microsoft.com/office/drawing/2016/5/13/chartex" xmlns:cx8="http://schemas.microsoft.com/office/drawing/2016/5/14/chartex" xmlns:mc="http://schemas.openxmlformats.org/markup-compatibility/2006" xmlns:aink="http://schemas.microsoft.com/office/drawing/2016/ink" xmlns:am3d="http://schemas.microsoft.com/office/drawing/2017/model3d" xmlns:o="urn:schemas-microsoft-com:office:office" xmlns:oel="http://schemas.microsoft.com/office/2019/extlst" xmlns:r="http://schemas.openxmlformats.org/officeDocument/2006/relationships" xmlns:m="http://schemas.openxmlformats.org/officeDocument/2006/math" xmlns:v="urn:schemas-microsoft-com:vml" xmlns:wp14="http://schemas.microsoft.com/office/word/2010/wordprocessingDrawing" xmlns:wp="http://schemas.openxmlformats.org/drawingml/2006/wordprocessingDrawing" xmlns:w10="urn:schemas-microsoft-com:office:word" xmlns:w="http://schemas.openxmlformats.org/wordprocessingml/2006/main" xmlns:w14="http://schemas.microsoft.com/office/word/2010/wordml" xmlns:w15="http://schemas.microsoft.com/office/word/2012/wordml" xmlns:w16cex="http://schemas.microsoft.com/office/word/2018/wordml/cex" xmlns:w16cid="http://schemas.microsoft.com/office/word/2016/wordml/cid" xmlns:w16="http://schemas.microsoft.com/office/word/2018/wordml" xmlns:w16du="http://schemas.microsoft.com/office/word/2023/wordml/word16du" xmlns:w16sdtdh="http://schemas.microsoft.com/office/word/2020/wordml/sdtdatahash" xmlns:w16se="http://schemas.microsoft.com/office/word/2015/wordml/symex" xmlns:wpg="http://schemas.microsoft.com/office/word/2010/wordprocessingGroup" xmlns:wpi="http://schemas.microsoft.com/office/word/2010/wordprocessingInk" xmlns:wne="http://schemas.microsoft.com/office/word/2006/wordml" xmlns:wps="http://schemas.microsoft.com/office/word/2010/wordprocessingShape" mc:Ignorable="w14 w15 w16se w16cid w16 w16cex w16sdtdh w16du wp14">
   <w:p>
     <w:pPr>
       <w:pStyle w:val="a4"/>
@@ -834,7 +920,7 @@
 </file>
 
 <file path=word/styles.xml><?xml version="1.0" encoding="utf-8"?>
-<w:styles xmlns:mc="http://schemas.openxmlformats.org/markup-compatibility/2006" xmlns:r="http://schemas.openxmlformats.org/officeDocument/2006/relationships" xmlns:w="http://schemas.openxmlformats.org/wordprocessingml/2006/main" xmlns:w14="http://schemas.microsoft.com/office/word/2010/wordml" xmlns:w15="http://schemas.microsoft.com/office/word/2012/wordml" xmlns:w16cex="http://schemas.microsoft.com/office/word/2018/wordml/cex" xmlns:w16cid="http://schemas.microsoft.com/office/word/2016/wordml/cid" xmlns:w16="http://schemas.microsoft.com/office/word/2018/wordml" xmlns:w16sdtdh="http://schemas.microsoft.com/office/word/2020/wordml/sdtdatahash" xmlns:w16se="http://schemas.microsoft.com/office/word/2015/wordml/symex" mc:Ignorable="w14 w15 w16se w16cid w16 w16cex w16sdtdh">
+<w:styles xmlns:mc="http://schemas.openxmlformats.org/markup-compatibility/2006" xmlns:r="http://schemas.openxmlformats.org/officeDocument/2006/relationships" xmlns:w="http://schemas.openxmlformats.org/wordprocessingml/2006/main" xmlns:w14="http://schemas.microsoft.com/office/word/2010/wordml" xmlns:w15="http://schemas.microsoft.com/office/word/2012/wordml" xmlns:w16cex="http://schemas.microsoft.com/office/word/2018/wordml/cex" xmlns:w16cid="http://schemas.microsoft.com/office/word/2016/wordml/cid" xmlns:w16="http://schemas.microsoft.com/office/word/2018/wordml" xmlns:w16du="http://schemas.microsoft.com/office/word/2023/wordml/word16du" xmlns:w16sdtdh="http://schemas.microsoft.com/office/word/2020/wordml/sdtdatahash" xmlns:w16se="http://schemas.microsoft.com/office/word/2015/wordml/symex" mc:Ignorable="w14 w15 w16se w16cid w16 w16cex w16sdtdh w16du">
   <w:docDefaults>
     <w:rPrDefault>
       <w:rPr>

</xml_diff>